<commit_message>
Update CSC111 Midterm Exam CR Sp2026 ANS.docx
</commit_message>
<xml_diff>
--- a/PPTs/Exams/CSC111 Midterm Exam CR Sp2026 ANS.docx
+++ b/PPTs/Exams/CSC111 Midterm Exam CR Sp2026 ANS.docx
@@ -4238,6 +4238,11 @@
       </w:r>
     </w:p>
     <w:p>
+      <w:pPr>
+        <w:rPr>
+          <w:rFonts w:eastAsiaTheme="minorEastAsia"/>
+        </w:rPr>
+      </w:pPr>
       <w:r>
         <w:rPr>
           <w:lang w:val="en-GB"/>
@@ -4336,6 +4341,11 @@
       </w:r>
     </w:p>
     <w:p>
+      <w:pPr>
+        <w:rPr>
+          <w:rFonts w:eastAsiaTheme="minorEastAsia"/>
+        </w:rPr>
+      </w:pPr>
       <w:r>
         <w:t>Explanation: C</w:t>
       </w:r>
@@ -4439,56 +4449,114 @@
       </w:r>
     </w:p>
     <w:p>
-      <w:r>
-        <w:rPr>
-          <w:rFonts w:hint="eastAsia"/>
-        </w:rPr>
-        <w:t xml:space="preserve">(b) </w:t>
-      </w:r>
-      <w:r>
-        <w:t>(</w:t>
-      </w:r>
-      <w:r>
-        <w:t xml:space="preserve">5 </w:t>
-      </w:r>
-      <w:r>
-        <w:t>points)</w:t>
-      </w:r>
-      <w:r>
-        <w:rPr>
-          <w:rFonts w:hint="eastAsia"/>
-        </w:rPr>
-        <w:t xml:space="preserve"> </w:t>
-      </w:r>
-      <w:r>
-        <w:t xml:space="preserve">Assume an 8-bit system. Copy bits </w:t>
-      </w:r>
-      <w:proofErr w:type="gramStart"/>
-      <w:r>
-        <w:t>5..</w:t>
-      </w:r>
-      <w:proofErr w:type="gramEnd"/>
-      <w:r>
-        <w:t xml:space="preserve">2 in R0 to bits </w:t>
-      </w:r>
-      <w:proofErr w:type="gramStart"/>
-      <w:r>
-        <w:t>3..</w:t>
-      </w:r>
-      <w:proofErr w:type="gramEnd"/>
-      <w:r>
-        <w:t xml:space="preserve">0 in </w:t>
-      </w:r>
-      <w:proofErr w:type="gramStart"/>
-      <w:r>
-        <w:t>R1, and</w:t>
-      </w:r>
-      <w:proofErr w:type="gramEnd"/>
-      <w:r>
-        <w:t xml:space="preserve"> keep the upper four bits in R1 unchanged.</w:t>
+      <w:pPr>
+        <w:rPr>
+          <w:rFonts w:eastAsiaTheme="minorEastAsia" w:hint="eastAsia"/>
+        </w:rPr>
+      </w:pPr>
+      <w:r>
+        <w:rPr>
+          <w:rFonts w:eastAsiaTheme="minorEastAsia"/>
+          <w:noProof/>
+        </w:rPr>
+        <w:drawing>
+          <wp:inline distT="0" distB="0" distL="0" distR="0" wp14:anchorId="437A93DC" wp14:editId="2CA23B13">
+            <wp:extent cx="2764559" cy="904875"/>
+            <wp:effectExtent l="0" t="0" r="0" b="0"/>
+            <wp:docPr id="1004058655" name="Picture 3" descr="The image displays a numerical sequence arranged in descending order, starting from 7 and ending at 2.&#10;&#10;AI-generated content may be incorrect."/>
+            <wp:cNvGraphicFramePr>
+              <a:graphicFrameLocks xmlns:a="http://schemas.openxmlformats.org/drawingml/2006/main" noChangeAspect="1"/>
+            </wp:cNvGraphicFramePr>
+            <a:graphic xmlns:a="http://schemas.openxmlformats.org/drawingml/2006/main">
+              <a:graphicData uri="http://schemas.openxmlformats.org/drawingml/2006/picture">
+                <pic:pic xmlns:pic="http://schemas.openxmlformats.org/drawingml/2006/picture">
+                  <pic:nvPicPr>
+                    <pic:cNvPr id="1004058655" name="Picture 3" descr="The image displays a numerical sequence arranged in descending order, starting from 7 and ending at 2.&#10;&#10;AI-generated content may be incorrect."/>
+                    <pic:cNvPicPr>
+                      <a:picLocks noChangeAspect="1" noChangeArrowheads="1"/>
+                    </pic:cNvPicPr>
+                  </pic:nvPicPr>
+                  <pic:blipFill>
+                    <a:blip r:embed="rId7">
+                      <a:extLst>
+                        <a:ext uri="{28A0092B-C50C-407E-A947-70E740481C1C}">
+                          <a14:useLocalDpi xmlns:a14="http://schemas.microsoft.com/office/drawing/2010/main" val="0"/>
+                        </a:ext>
+                      </a:extLst>
+                    </a:blip>
+                    <a:srcRect/>
+                    <a:stretch>
+                      <a:fillRect/>
+                    </a:stretch>
+                  </pic:blipFill>
+                  <pic:spPr bwMode="auto">
+                    <a:xfrm>
+                      <a:off x="0" y="0"/>
+                      <a:ext cx="2773857" cy="907918"/>
+                    </a:xfrm>
+                    <a:prstGeom prst="rect">
+                      <a:avLst/>
+                    </a:prstGeom>
+                    <a:noFill/>
+                  </pic:spPr>
+                </pic:pic>
+              </a:graphicData>
+            </a:graphic>
+          </wp:inline>
+        </w:drawing>
       </w:r>
     </w:p>
     <w:p>
+      <w:r>
+        <w:rPr>
+          <w:rFonts w:hint="eastAsia"/>
+        </w:rPr>
+        <w:t xml:space="preserve">(b) </w:t>
+      </w:r>
+      <w:r>
+        <w:t>(</w:t>
+      </w:r>
+      <w:r>
+        <w:t xml:space="preserve">5 </w:t>
+      </w:r>
+      <w:r>
+        <w:t>points)</w:t>
+      </w:r>
+      <w:r>
+        <w:rPr>
+          <w:rFonts w:hint="eastAsia"/>
+        </w:rPr>
+        <w:t xml:space="preserve"> </w:t>
+      </w:r>
+      <w:r>
+        <w:t xml:space="preserve">Assume an 8-bit system. Copy bits </w:t>
+      </w:r>
+      <w:proofErr w:type="gramStart"/>
+      <w:r>
+        <w:t>5..</w:t>
+      </w:r>
+      <w:proofErr w:type="gramEnd"/>
+      <w:r>
+        <w:t xml:space="preserve">2 in R0 to bits </w:t>
+      </w:r>
+      <w:proofErr w:type="gramStart"/>
+      <w:r>
+        <w:t>3..</w:t>
+      </w:r>
+      <w:proofErr w:type="gramEnd"/>
+      <w:r>
+        <w:t xml:space="preserve">0 in </w:t>
+      </w:r>
+      <w:proofErr w:type="gramStart"/>
+      <w:r>
+        <w:t>R1, and</w:t>
+      </w:r>
+      <w:proofErr w:type="gramEnd"/>
+      <w:r>
+        <w:t xml:space="preserve"> keep the upper four bits in R1 unchanged.</w:t>
+      </w:r>
+    </w:p>
+    <w:p>
       <w:pPr>
         <w:spacing w:after="0"/>
       </w:pPr>
@@ -4528,10 +4596,11 @@
     <w:p>
       <w:pPr>
         <w:rPr>
-          <w:rFonts w:ascii="Times New Roman" w:hAnsi="Times New Roman" w:cs="Times New Roman"/>
-        </w:rPr>
-      </w:pPr>
-      <w:r>
+          <w:rFonts w:eastAsiaTheme="minorEastAsia"/>
+        </w:rPr>
+      </w:pPr>
+      <w:r>
+        <w:lastRenderedPageBreak/>
         <w:t xml:space="preserve">Explanation: </w:t>
       </w:r>
       <w:r>
@@ -4620,11 +4689,68 @@
       </w:r>
     </w:p>
     <w:p>
+      <w:pPr>
+        <w:rPr>
+          <w:rFonts w:ascii="Times New Roman" w:eastAsiaTheme="minorEastAsia" w:hAnsi="Times New Roman" w:cs="Times New Roman" w:hint="eastAsia"/>
+        </w:rPr>
+      </w:pPr>
+      <w:r>
+        <w:rPr>
+          <w:rFonts w:ascii="Times New Roman" w:eastAsiaTheme="minorEastAsia" w:hAnsi="Times New Roman" w:cs="Times New Roman"/>
+          <w:noProof/>
+        </w:rPr>
+        <w:drawing>
+          <wp:inline distT="0" distB="0" distL="0" distR="0" wp14:anchorId="1581E97C" wp14:editId="46DD67E5">
+            <wp:extent cx="2961643" cy="952500"/>
+            <wp:effectExtent l="0" t="0" r="0" b="0"/>
+            <wp:docPr id="162783193" name="Picture 4"/>
+            <wp:cNvGraphicFramePr>
+              <a:graphicFrameLocks xmlns:a="http://schemas.openxmlformats.org/drawingml/2006/main" noChangeAspect="1"/>
+            </wp:cNvGraphicFramePr>
+            <a:graphic xmlns:a="http://schemas.openxmlformats.org/drawingml/2006/main">
+              <a:graphicData uri="http://schemas.openxmlformats.org/drawingml/2006/picture">
+                <pic:pic xmlns:pic="http://schemas.openxmlformats.org/drawingml/2006/picture">
+                  <pic:nvPicPr>
+                    <pic:cNvPr id="162783193" name="Picture 4"/>
+                    <pic:cNvPicPr>
+                      <a:picLocks noChangeAspect="1" noChangeArrowheads="1"/>
+                    </pic:cNvPicPr>
+                  </pic:nvPicPr>
+                  <pic:blipFill>
+                    <a:blip r:embed="rId8">
+                      <a:extLst>
+                        <a:ext uri="{28A0092B-C50C-407E-A947-70E740481C1C}">
+                          <a14:useLocalDpi xmlns:a14="http://schemas.microsoft.com/office/drawing/2010/main" val="0"/>
+                        </a:ext>
+                      </a:extLst>
+                    </a:blip>
+                    <a:srcRect/>
+                    <a:stretch>
+                      <a:fillRect/>
+                    </a:stretch>
+                  </pic:blipFill>
+                  <pic:spPr bwMode="auto">
+                    <a:xfrm>
+                      <a:off x="0" y="0"/>
+                      <a:ext cx="2970449" cy="955332"/>
+                    </a:xfrm>
+                    <a:prstGeom prst="rect">
+                      <a:avLst/>
+                    </a:prstGeom>
+                    <a:noFill/>
+                  </pic:spPr>
+                </pic:pic>
+              </a:graphicData>
+            </a:graphic>
+          </wp:inline>
+        </w:drawing>
+      </w:r>
+    </w:p>
+    <w:p>
       <w:r>
         <w:rPr>
           <w:lang w:val="en-GB"/>
         </w:rPr>
-        <w:lastRenderedPageBreak/>
         <w:t>(c)</w:t>
       </w:r>
       <w:r>
@@ -5045,6 +5171,7 @@
       </w:pPr>
       <w:bookmarkStart w:id="7" w:name="explanation"/>
       <w:r>
+        <w:lastRenderedPageBreak/>
         <w:t>Explanation</w:t>
       </w:r>
       <w:bookmarkEnd w:id="7"/>
@@ -5244,7 +5371,6 @@
         </w:numPr>
       </w:pPr>
       <w:r>
-        <w:lastRenderedPageBreak/>
         <w:t xml:space="preserve">Instruction: </w:t>
       </w:r>
       <w:r>
@@ -6167,6 +6293,7 @@
     <w:p/>
     <w:p>
       <w:r>
+        <w:lastRenderedPageBreak/>
         <w:t>Final register values:</w:t>
       </w:r>
     </w:p>
@@ -6404,7 +6531,6 @@
     <w:p/>
     <w:p>
       <w:r>
-        <w:lastRenderedPageBreak/>
         <w:t>Final memory contents:</w:t>
       </w:r>
     </w:p>
@@ -8133,6 +8259,7 @@
           <w:szCs w:val="22"/>
           <w:shd w:val="clear" w:color="auto" w:fill="F8F8FA"/>
         </w:rPr>
+        <w:lastRenderedPageBreak/>
         <w:t>STR R7, [</w:t>
       </w:r>
       <w:proofErr w:type="gramStart"/>
@@ -8461,7 +8588,6 @@
           <w:sz w:val="20"/>
           <w:szCs w:val="21"/>
         </w:rPr>
-        <w:lastRenderedPageBreak/>
         <w:t xml:space="preserve">uint32_t z = </w:t>
       </w:r>
       <w:proofErr w:type="gramStart"/>
@@ -9057,6 +9183,7 @@
             </w:pPr>
             <w:proofErr w:type="gramStart"/>
             <w:r>
+              <w:lastRenderedPageBreak/>
               <w:t>ADD  R</w:t>
             </w:r>
             <w:proofErr w:type="gramEnd"/>
@@ -9401,7 +9528,6 @@
             </w:pPr>
             <w:proofErr w:type="gramStart"/>
             <w:r>
-              <w:lastRenderedPageBreak/>
               <w:t>STR  R</w:t>
             </w:r>
             <w:proofErr w:type="gramEnd"/>
@@ -10094,7 +10220,7 @@
       </w:r>
     </w:p>
     <w:sectPr>
-      <w:headerReference w:type="default" r:id="rId7"/>
+      <w:headerReference w:type="default" r:id="rId9"/>
       <w:pgSz w:w="11906" w:h="16838"/>
       <w:pgMar w:top="1440" w:right="1080" w:bottom="1440" w:left="1080" w:header="708" w:footer="708" w:gutter="0"/>
       <w:cols w:space="708"/>

</xml_diff>